<commit_message>
fix: wrap eyebrow labels below md to stop mobile horizontal overflow
The eyebrow-label atom forced white-space: nowrap, so long eyebrows
(e.g. "06 · About · the one-paragraph version") set a min-content width
wider than narrow columns and pushed the page past the viewport
(iPhone SE +74px, iPad Mini +10px). Allow wrapping below bp(md) while
keeping the single-line Figma spec on desktop.

Also refresh the site one-line description and update the CV docx, and
ignore the local old-portfolio-archive, CV backups, and reference PDFs.
</commit_message>
<xml_diff>
--- a/documents/Davide_Domenghini_CV_Revamped.docx
+++ b/documents/Davide_Domenghini_CV_Revamped.docx
@@ -106,7 +106,7 @@
           <w:szCs w:val="22"/>
           <w:rtl w:val="0"/>
         </w:rPr>
-        <w:t xml:space="preserve">I'm a Senior Front-End Engineer and founder with 20+ years of experience building scalable, high-performance web applications for some of the world's most demanding brands — Sky, Estée Lauder, Liberty Global, Bristol City Council, EE, and A+E Networks. I specialise in React, Next.js and TypeScript, and I love the moment when a complex multi-step product finally feels effortless to use.</w:t>
+        <w:t xml:space="preserve">I'm a Senior Front-End Engineer and founder with 20+ years of experience building scalable, high-performance web applications for some of the world's most demanding brands - Sky, Estée Lauder, Liberty Global, Bristol City Council, EE, and A+E Networks. I specialise in React, Next.js and TypeScript, and I love the moment when a complex multi-step product finally feels effortless to use.</w:t>
       </w:r>
       <w:r>
         <w:rPr>
@@ -127,7 +127,7 @@
           <w:szCs w:val="22"/>
           <w:rtl w:val="0"/>
         </w:rPr>
-        <w:t xml:space="preserve">What sets me apart is range: I can architect a 12-step financial lending platform one day and prototype an experimental WebGL interface the next. I lead frontend delivery on enterprise platforms generating multi-million euro revenue, but I'm equally at home mentoring juniors, mastering AI-assisted workflows, and turning a rough idea into a working MVP. I'm currently building Nannynow.co.uk, a consumer product connecting families with childcare — end-to-end from architecture to launch — because I believe the best engineers know how to ship product, not just code.</w:t>
+        <w:t xml:space="preserve">What sets me apart is range: I can architect a 12-step financial lending platform one day and prototype an experimental WebGL interface the next. I lead frontend delivery on enterprise platforms generating multi-million euro revenue, but I'm equally at home mentoring juniors, mastering AI-assisted workflows, and turning a rough idea into a working MVP. I'm currently building Nannynow.co.uk, a consumer product connecting families with childcare - end-to-end from architecture to launch - because I believe the best engineers know how to ship product, not just code.</w:t>
       </w:r>
       <w:r>
         <w:rPr>
@@ -593,7 +593,7 @@
           <w:szCs w:val="22"/>
           <w:rtl w:val="0"/>
         </w:rPr>
-        <w:t xml:space="preserve">I've spent the past two years embedding AI tools into my workflow — not as a shortcut, but as a force multiplier. With AI in the loop, I now ship full-stack features end-to-end that I'd previously have needed a cross-functional team to deliver. My view: AI doesn't replace senior engineering judgement, it amplifies it.</w:t>
+        <w:t xml:space="preserve">I've spent the past two years embedding AI tools into my workflow - not as a shortcut, but as a force multiplier. With AI in the loop, I now ship full-stack features end-to-end that I'd previously have needed a cross-functional team to deliver. My view: AI doesn't replace senior engineering judgement, it amplifies it.</w:t>
       </w:r>
       <w:r>
         <w:rPr>
@@ -660,7 +660,7 @@
           <w:vertAlign w:val="baseline"/>
           <w:rtl w:val="0"/>
         </w:rPr>
-        <w:t xml:space="preserve">Built Nannynow.co.uk end-to-end — data model, API, frontend, deployment — work that pre-AI would have needed a backend engineer in the loop. Architecture and final calls stay with me.</w:t>
+        <w:t xml:space="preserve">Built Nannynow.co.uk end-to-end - data model, API, frontend, deployment - work that pre-AI would have needed a backend engineer in the loop. Architecture and final calls stay with me.</w:t>
       </w:r>
     </w:p>
     <w:p>
@@ -722,7 +722,7 @@
           <w:vertAlign w:val="baseline"/>
           <w:rtl w:val="0"/>
         </w:rPr>
-        <w:t xml:space="preserve">Solve in hours what used to take days, across unfamiliar stacks and legacy codebases — the diagnostic loop between “something's wrong” and “I know why” has collapsed.</w:t>
+        <w:t xml:space="preserve">Solve in hours what used to take days, across unfamiliar stacks and legacy codebases - the diagnostic loop between “something's wrong” and “I know why” has collapsed.</w:t>
       </w:r>
     </w:p>
     <w:p>
@@ -784,7 +784,7 @@
           <w:vertAlign w:val="baseline"/>
           <w:rtl w:val="0"/>
         </w:rPr>
-        <w:t xml:space="preserve">I treat AI output with the scepticism I'd apply to a mid-level pull request. Fast to generate, slower to verify — and verification is where senior engineers earn their keep.</w:t>
+        <w:t xml:space="preserve">I treat AI output with the scepticism I'd apply to a mid-level pull request. Fast to generate, slower to verify - and verification is where senior engineers earn their keep.</w:t>
       </w:r>
     </w:p>
     <w:p>
@@ -812,7 +812,7 @@
           <w:szCs w:val="22"/>
           <w:rtl w:val="0"/>
         </w:rPr>
-        <w:t xml:space="preserve">Cursor, Claude Code, GitHub Copilot, ChatGPT — chosen by task, not habit.</w:t>
+        <w:t xml:space="preserve">Cursor, Claude Code, GitHub Copilot, ChatGPT - chosen by task, not habit.</w:t>
       </w:r>
       <w:r>
         <w:rPr>
@@ -894,7 +894,7 @@
           <w:szCs w:val="20"/>
           <w:rtl w:val="0"/>
         </w:rPr>
-        <w:t xml:space="preserve">2026 – Present</w:t>
+        <w:t xml:space="preserve">2026 - Present</w:t>
       </w:r>
       <w:r>
         <w:rPr>
@@ -915,7 +915,7 @@
           <w:szCs w:val="22"/>
           <w:rtl w:val="0"/>
         </w:rPr>
-        <w:t xml:space="preserve">I'm building Nannynow from concept to MVP — a consumer product that connects families with trusted childcare. I own everything: product strategy, architecture, UX, delivery. It's the project I always wanted to do, where I can prove that a senior engineer can move as fast as a startup founder when the layers between idea and ship are removed.</w:t>
+        <w:t xml:space="preserve">I'm building Nannynow from concept to MVP - a consumer product that connects families with trusted childcare. I own everything: product strategy, architecture, UX, delivery. It's the project I always wanted to do, where I can prove that a senior engineer can move as fast as a startup founder when the layers between idea and ship are removed.</w:t>
       </w:r>
       <w:r>
         <w:rPr>
@@ -1163,7 +1163,7 @@
           <w:szCs w:val="20"/>
           <w:rtl w:val="0"/>
         </w:rPr>
-        <w:t xml:space="preserve">2026 – Present</w:t>
+        <w:t xml:space="preserve">2026 - Present</w:t>
       </w:r>
       <w:r>
         <w:rPr>
@@ -1184,55 +1184,55 @@
           <w:szCs w:val="22"/>
           <w:rtl w:val="0"/>
         </w:rPr>
-        <w:t xml:space="preserve">Striver.Football is a live consumer brand in the youth football space. I came in once the strategy and brand voice work was in place, and took it from guidelines to a shipped, production website — directing design and frontend execution end-to-end.</w:t>
-      </w:r>
-      <w:r>
-        <w:rPr>
-          <w:rtl w:val="0"/>
-        </w:rPr>
-      </w:r>
-    </w:p>
-    <w:p>
-      <w:pPr>
-        <w:keepNext w:val="0"/>
-        <w:keepLines w:val="0"/>
-        <w:pageBreakBefore w:val="0"/>
-        <w:widowControl w:val="1"/>
-        <w:numPr>
-          <w:ilvl w:val="0"/>
-          <w:numId w:val="1"/>
-        </w:numPr>
-        <w:pBdr>
-          <w:top w:space="0" w:sz="0" w:val="nil"/>
-          <w:left w:space="0" w:sz="0" w:val="nil"/>
-          <w:bottom w:space="0" w:sz="0" w:val="nil"/>
-          <w:right w:space="0" w:sz="0" w:val="nil"/>
-          <w:between w:space="0" w:sz="0" w:val="nil"/>
-        </w:pBdr>
-        <w:shd w:fill="auto" w:val="clear"/>
-        <w:spacing w:after="80" w:before="0" w:line="280" w:lineRule="auto"/>
-        <w:ind w:left="360" w:right="0" w:hanging="260"/>
-        <w:jc w:val="left"/>
-        <w:rPr/>
-      </w:pPr>
-      <w:r>
-        <w:rPr>
-          <w:rFonts w:ascii="Calibri" w:cs="Calibri" w:eastAsia="Calibri" w:hAnsi="Calibri"/>
-          <w:b w:val="0"/>
-          <w:bCs w:val="0"/>
-          <w:i w:val="0"/>
-          <w:iCs w:val="0"/>
-          <w:smallCaps w:val="0"/>
-          <w:strike w:val="0"/>
-          <w:color w:val="1a1a1a"/>
-          <w:sz w:val="22"/>
-          <w:szCs w:val="22"/>
-          <w:u w:val="none"/>
-          <w:shd w:fill="auto" w:val="clear"/>
-          <w:vertAlign w:val="baseline"/>
-          <w:rtl w:val="0"/>
-        </w:rPr>
-        <w:t xml:space="preserve">Translated the brand strategy and voice guideline document into a working design system — tokens, typography, colour, pattern, motion — codified in SCSS and surfaced as a living design-system page the whole team works from.</w:t>
+        <w:t xml:space="preserve">Striver.Football is a live consumer brand in the youth football space. I came in once the strategy and brand voice work was in place, and took it from guidelines to a shipped, production website - directing design and frontend execution end-to-end.</w:t>
+      </w:r>
+      <w:r>
+        <w:rPr>
+          <w:rtl w:val="0"/>
+        </w:rPr>
+      </w:r>
+    </w:p>
+    <w:p>
+      <w:pPr>
+        <w:keepNext w:val="0"/>
+        <w:keepLines w:val="0"/>
+        <w:pageBreakBefore w:val="0"/>
+        <w:widowControl w:val="1"/>
+        <w:numPr>
+          <w:ilvl w:val="0"/>
+          <w:numId w:val="1"/>
+        </w:numPr>
+        <w:pBdr>
+          <w:top w:space="0" w:sz="0" w:val="nil"/>
+          <w:left w:space="0" w:sz="0" w:val="nil"/>
+          <w:bottom w:space="0" w:sz="0" w:val="nil"/>
+          <w:right w:space="0" w:sz="0" w:val="nil"/>
+          <w:between w:space="0" w:sz="0" w:val="nil"/>
+        </w:pBdr>
+        <w:shd w:fill="auto" w:val="clear"/>
+        <w:spacing w:after="80" w:before="0" w:line="280" w:lineRule="auto"/>
+        <w:ind w:left="360" w:right="0" w:hanging="260"/>
+        <w:jc w:val="left"/>
+        <w:rPr/>
+      </w:pPr>
+      <w:r>
+        <w:rPr>
+          <w:rFonts w:ascii="Calibri" w:cs="Calibri" w:eastAsia="Calibri" w:hAnsi="Calibri"/>
+          <w:b w:val="0"/>
+          <w:bCs w:val="0"/>
+          <w:i w:val="0"/>
+          <w:iCs w:val="0"/>
+          <w:smallCaps w:val="0"/>
+          <w:strike w:val="0"/>
+          <w:color w:val="1a1a1a"/>
+          <w:sz w:val="22"/>
+          <w:szCs w:val="22"/>
+          <w:u w:val="none"/>
+          <w:shd w:fill="auto" w:val="clear"/>
+          <w:vertAlign w:val="baseline"/>
+          <w:rtl w:val="0"/>
+        </w:rPr>
+        <w:t xml:space="preserve">Translated the brand strategy and voice guideline document into a working design system - tokens, typography, colour, pattern, motion - codified in SCSS and surfaced as a living design-system page the whole team works from.</w:t>
       </w:r>
       <w:r>
         <w:rPr>
@@ -1424,7 +1424,7 @@
           <w:vertAlign w:val="baseline"/>
           <w:rtl w:val="0"/>
         </w:rPr>
-        <w:t xml:space="preserve">Established a “brand-as-code” workflow — brand definition as the single source of truth, automated voice and visual guardrails — so every artifact ships consistent with the identity.</w:t>
+        <w:t xml:space="preserve">Established a “brand-as-code” workflow - brand definition as the single source of truth, automated voice and visual guardrails - so every artifact ships consistent with the identity.</w:t>
       </w:r>
       <w:r>
         <w:rPr>
@@ -1503,7 +1503,7 @@
           <w:szCs w:val="20"/>
           <w:rtl w:val="0"/>
         </w:rPr>
-        <w:t xml:space="preserve">2024 – Present</w:t>
+        <w:t xml:space="preserve">2024 - Present</w:t>
       </w:r>
       <w:r>
         <w:rPr>
@@ -1524,7 +1524,7 @@
           <w:szCs w:val="22"/>
           <w:rtl w:val="0"/>
         </w:rPr>
-        <w:t xml:space="preserve">I coach a youth team at Cheam Sports FC and over the last two years I've also built and shipped the club's entire digital platform end-to-end — a production application serving 100+ families across marketing site, member portal, payment flow, admin dashboard and automated content pipeline. Same proof point as Nannynow: with AI in the loop, one senior frontend engineer can deliver what would historically have needed a small cross-functional team.</w:t>
+        <w:t xml:space="preserve">I coach a youth team at Cheam Sports FC and over the last two years I've also built and shipped the club's entire digital platform end-to-end - a production application serving 100+ families across marketing site, member portal, payment flow, admin dashboard and automated content pipeline. Same proof point as Nannynow: with AI in the loop, one senior frontend engineer can deliver what would historically have needed a small cross-functional team.</w:t>
       </w:r>
       <w:r>
         <w:rPr>
@@ -1964,7 +1964,7 @@
           <w:szCs w:val="22"/>
           <w:rtl w:val="0"/>
         </w:rPr>
-        <w:t xml:space="preserve">  |  Liberty Blume – Liberty Global</w:t>
+        <w:t xml:space="preserve">  |  Liberty Blume - Liberty Global</w:t>
       </w:r>
       <w:r>
         <w:rPr>
@@ -1987,7 +1987,7 @@
           <w:szCs w:val="20"/>
           <w:rtl w:val="0"/>
         </w:rPr>
-        <w:t xml:space="preserve">03/2025 – Present</w:t>
+        <w:t xml:space="preserve">03/2025 - Present</w:t>
       </w:r>
       <w:r>
         <w:rPr>
@@ -2104,7 +2104,7 @@
           <w:vertAlign w:val="baseline"/>
           <w:rtl w:val="0"/>
         </w:rPr>
-        <w:t xml:space="preserve">Implemented robust data validation and transformation for financial inputs, ensuring compliance with lending and security standards.</w:t>
+        <w:t xml:space="preserve">Implemented rigorous data validation and transformation for financial inputs, ensuring compliance with lending and security standards.</w:t>
       </w:r>
       <w:r>
         <w:rPr>
@@ -2352,7 +2352,7 @@
           <w:szCs w:val="20"/>
           <w:rtl w:val="0"/>
         </w:rPr>
-        <w:t xml:space="preserve">05/2022 – 02/2025</w:t>
+        <w:t xml:space="preserve">05/2022 - 02/2025</w:t>
       </w:r>
       <w:r>
         <w:rPr>
@@ -2692,7 +2692,7 @@
           <w:szCs w:val="20"/>
           <w:rtl w:val="0"/>
         </w:rPr>
-        <w:t xml:space="preserve">12/2021 – 05/2022</w:t>
+        <w:t xml:space="preserve">12/2021 - 05/2022</w:t>
       </w:r>
       <w:r>
         <w:rPr>
@@ -3032,7 +3032,7 @@
           <w:szCs w:val="20"/>
           <w:rtl w:val="0"/>
         </w:rPr>
-        <w:t xml:space="preserve">02/2021 – 10/2021</w:t>
+        <w:t xml:space="preserve">02/2021 - 10/2021</w:t>
       </w:r>
       <w:r>
         <w:rPr>
@@ -3324,7 +3324,7 @@
           <w:szCs w:val="20"/>
           <w:rtl w:val="0"/>
         </w:rPr>
-        <w:t xml:space="preserve">03/2020 – 02/2021</w:t>
+        <w:t xml:space="preserve">03/2020 - 02/2021</w:t>
       </w:r>
       <w:r>
         <w:rPr>
@@ -3451,55 +3451,55 @@
           <w:szCs w:val="20"/>
           <w:rtl w:val="0"/>
         </w:rPr>
-        <w:t xml:space="preserve">11/2017 – 03/2020</w:t>
-      </w:r>
-      <w:r>
-        <w:rPr>
-          <w:rtl w:val="0"/>
-        </w:rPr>
-      </w:r>
-    </w:p>
-    <w:p>
-      <w:pPr>
-        <w:keepNext w:val="0"/>
-        <w:keepLines w:val="0"/>
-        <w:pageBreakBefore w:val="0"/>
-        <w:widowControl w:val="1"/>
-        <w:numPr>
-          <w:ilvl w:val="0"/>
-          <w:numId w:val="1"/>
-        </w:numPr>
-        <w:pBdr>
-          <w:top w:space="0" w:sz="0" w:val="nil"/>
-          <w:left w:space="0" w:sz="0" w:val="nil"/>
-          <w:bottom w:space="0" w:sz="0" w:val="nil"/>
-          <w:right w:space="0" w:sz="0" w:val="nil"/>
-          <w:between w:space="0" w:sz="0" w:val="nil"/>
-        </w:pBdr>
-        <w:shd w:fill="auto" w:val="clear"/>
-        <w:spacing w:after="80" w:before="0" w:line="280" w:lineRule="auto"/>
-        <w:ind w:left="360" w:right="0" w:hanging="260"/>
-        <w:jc w:val="left"/>
-        <w:rPr/>
-      </w:pPr>
-      <w:r>
-        <w:rPr>
-          <w:rFonts w:ascii="Calibri" w:cs="Calibri" w:eastAsia="Calibri" w:hAnsi="Calibri"/>
-          <w:b w:val="0"/>
-          <w:bCs w:val="0"/>
-          <w:i w:val="0"/>
-          <w:iCs w:val="0"/>
-          <w:smallCaps w:val="0"/>
-          <w:strike w:val="0"/>
-          <w:color w:val="1a1a1a"/>
-          <w:sz w:val="22"/>
-          <w:szCs w:val="22"/>
-          <w:u w:val="none"/>
-          <w:shd w:fill="auto" w:val="clear"/>
-          <w:vertAlign w:val="baseline"/>
-          <w:rtl w:val="0"/>
-        </w:rPr>
-        <w:t xml:space="preserve">Led technical delivery on cutting-edge ABM (Account-Based Marketing) projects for top global tech clients, running technical meetings and mentoring junior talent.</w:t>
+        <w:t xml:space="preserve">11/2017 - 03/2020</w:t>
+      </w:r>
+      <w:r>
+        <w:rPr>
+          <w:rtl w:val="0"/>
+        </w:rPr>
+      </w:r>
+    </w:p>
+    <w:p>
+      <w:pPr>
+        <w:keepNext w:val="0"/>
+        <w:keepLines w:val="0"/>
+        <w:pageBreakBefore w:val="0"/>
+        <w:widowControl w:val="1"/>
+        <w:numPr>
+          <w:ilvl w:val="0"/>
+          <w:numId w:val="1"/>
+        </w:numPr>
+        <w:pBdr>
+          <w:top w:space="0" w:sz="0" w:val="nil"/>
+          <w:left w:space="0" w:sz="0" w:val="nil"/>
+          <w:bottom w:space="0" w:sz="0" w:val="nil"/>
+          <w:right w:space="0" w:sz="0" w:val="nil"/>
+          <w:between w:space="0" w:sz="0" w:val="nil"/>
+        </w:pBdr>
+        <w:shd w:fill="auto" w:val="clear"/>
+        <w:spacing w:after="80" w:before="0" w:line="280" w:lineRule="auto"/>
+        <w:ind w:left="360" w:right="0" w:hanging="260"/>
+        <w:jc w:val="left"/>
+        <w:rPr/>
+      </w:pPr>
+      <w:r>
+        <w:rPr>
+          <w:rFonts w:ascii="Calibri" w:cs="Calibri" w:eastAsia="Calibri" w:hAnsi="Calibri"/>
+          <w:b w:val="0"/>
+          <w:bCs w:val="0"/>
+          <w:i w:val="0"/>
+          <w:iCs w:val="0"/>
+          <w:smallCaps w:val="0"/>
+          <w:strike w:val="0"/>
+          <w:color w:val="1a1a1a"/>
+          <w:sz w:val="22"/>
+          <w:szCs w:val="22"/>
+          <w:u w:val="none"/>
+          <w:shd w:fill="auto" w:val="clear"/>
+          <w:vertAlign w:val="baseline"/>
+          <w:rtl w:val="0"/>
+        </w:rPr>
+        <w:t xml:space="preserve">Led technical delivery on high-profile ABM (Account-Based Marketing) projects for top global tech clients, running technical meetings and mentoring junior talent.</w:t>
       </w:r>
       <w:r>
         <w:rPr>
@@ -3593,7 +3593,7 @@
           <w:szCs w:val="22"/>
           <w:rtl w:val="0"/>
         </w:rPr>
-        <w:t xml:space="preserve">Earlier Roles – Senior Front-End Developer</w:t>
+        <w:t xml:space="preserve">Earlier Roles - Senior Front-End Developer</w:t>
       </w:r>
       <w:r>
         <w:rPr>
@@ -3626,7 +3626,7 @@
           <w:szCs w:val="20"/>
           <w:rtl w:val="0"/>
         </w:rPr>
-        <w:t xml:space="preserve">2006 – 2017</w:t>
+        <w:t xml:space="preserve">2006 - 2017</w:t>
       </w:r>
       <w:r>
         <w:rPr>
@@ -3819,7 +3819,7 @@
           <w:vertAlign w:val="baseline"/>
           <w:rtl w:val="0"/>
         </w:rPr>
-        <w:t xml:space="preserve">A+E Networks EMEA (2016–17): </w:t>
+        <w:t xml:space="preserve">A+E Networks EMEA (2016-17): </w:t>
       </w:r>
       <w:r>
         <w:rPr>
@@ -4005,7 +4005,7 @@
           <w:vertAlign w:val="baseline"/>
           <w:rtl w:val="0"/>
         </w:rPr>
-        <w:t xml:space="preserve">Sky TV (2013–16): </w:t>
+        <w:t xml:space="preserve">Sky TV (2013-16): </w:t>
       </w:r>
       <w:r>
         <w:rPr>
@@ -4129,7 +4129,7 @@
           <w:vertAlign w:val="baseline"/>
           <w:rtl w:val="0"/>
         </w:rPr>
-        <w:t xml:space="preserve">Hogarth &amp; Ogilvy (2012–13): </w:t>
+        <w:t xml:space="preserve">Hogarth &amp; Ogilvy (2012-13): </w:t>
       </w:r>
       <w:r>
         <w:rPr>
@@ -4253,7 +4253,7 @@
           <w:vertAlign w:val="baseline"/>
           <w:rtl w:val="0"/>
         </w:rPr>
-        <w:t xml:space="preserve">RAPP UK (2011–12): </w:t>
+        <w:t xml:space="preserve">RAPP UK (2011-12): </w:t>
       </w:r>
       <w:r>
         <w:rPr>
@@ -4315,7 +4315,7 @@
           <w:vertAlign w:val="baseline"/>
           <w:rtl w:val="0"/>
         </w:rPr>
-        <w:t xml:space="preserve">Comic Relief (2010–11): </w:t>
+        <w:t xml:space="preserve">Comic Relief (2010-11): </w:t>
       </w:r>
       <w:r>
         <w:rPr>
@@ -4377,7 +4377,7 @@
           <w:vertAlign w:val="baseline"/>
           <w:rtl w:val="0"/>
         </w:rPr>
-        <w:t xml:space="preserve">Inmarsat (2007–10): </w:t>
+        <w:t xml:space="preserve">Inmarsat (2007-10): </w:t>
       </w:r>
       <w:r>
         <w:rPr>
@@ -4439,7 +4439,7 @@
           <w:vertAlign w:val="baseline"/>
           <w:rtl w:val="0"/>
         </w:rPr>
-        <w:t xml:space="preserve">TUISKI (2006–07): </w:t>
+        <w:t xml:space="preserve">TUISKI (2006-07): </w:t>
       </w:r>
       <w:r>
         <w:rPr>
@@ -4502,7 +4502,7 @@
           <w:szCs w:val="22"/>
           <w:rtl w:val="0"/>
         </w:rPr>
-        <w:t xml:space="preserve">Grassroots Football Coach — Cheam Sports FC, Surrey</w:t>
+        <w:t xml:space="preserve">Grassroots Football Coach - Cheam Sports FC, Surrey</w:t>
       </w:r>
       <w:r>
         <w:rPr>
@@ -4523,7 +4523,7 @@
           <w:szCs w:val="22"/>
           <w:rtl w:val="0"/>
         </w:rPr>
-        <w:t xml:space="preserve">For the past 6 years I've been coaching and managing a youth team at Cheam Sports FC. What I love most is the psychology side: understanding how to motivate different personalities, build confidence in the quieter kids, channel the energy of the louder ones. It's taught me that great leadership isn't about authority — it's about creating an environment where people want to give their best. The same instincts shape how I mentor junior developers and lead frontend teams. (The club's digital platform listed above grew out of this; the domain knowledge also feeds directly into my work on Striver.Football.)</w:t>
+        <w:t xml:space="preserve">For the past 6 years I've been coaching and managing a youth team at Cheam Sports FC. What I love most is the psychology side: understanding how to motivate different personalities, build confidence in the quieter kids, channel the energy of the louder ones. It's taught me that great leadership isn't about authority - it's about creating an environment where people want to give their best. The same instincts shape how I mentor junior developers and lead frontend teams. (The club's digital platform listed above grew out of this; the domain knowledge also feeds directly into my work on Striver.Football.)</w:t>
       </w:r>
       <w:r>
         <w:rPr>
@@ -4567,7 +4567,7 @@
           <w:szCs w:val="22"/>
           <w:rtl w:val="0"/>
         </w:rPr>
-        <w:t xml:space="preserve">Outside client work, I keep my hands dirty with Three.js, WebGL and GSAP — building experimental interfaces and interactive prototypes. It's where I test ideas that later show up, more disciplined, in production work.</w:t>
+        <w:t xml:space="preserve">Outside client work, I keep my hands dirty with Three.js, WebGL and GSAP - building experimental interfaces and interactive prototypes. It's where I test ideas that later show up, more disciplined, in production work.</w:t>
       </w:r>
       <w:r>
         <w:rPr>

</xml_diff>